<commit_message>
Fixed Simulator Firmware and Documentation
Addressing errors in main.c and the documentation. New verification and decoding tools have been created.
</commit_message>
<xml_diff>
--- a/1_SoftSIM_and_Simulator_Setup_Guide_v5.docx
+++ b/1_SoftSIM_and_Simulator_Setup_Guide_v5.docx
@@ -518,21 +518,7 @@
               <w:rPr>
                 <w:sz w:val="17"/>
               </w:rPr>
-              <w:t xml:space="preserve">Install/build/flash the simulator. Use direct LTE where LTE-M is </w:t>
-            </w:r>
-            <w:proofErr w:type="gramStart"/>
-            <w:r>
-              <w:rPr>
-                <w:sz w:val="17"/>
-              </w:rPr>
-              <w:t>available, or</w:t>
-            </w:r>
-            <w:proofErr w:type="gramEnd"/>
-            <w:r>
-              <w:rPr>
-                <w:sz w:val="17"/>
-              </w:rPr>
-              <w:t xml:space="preserve"> choose relay mode as a backup.</w:t>
+              <w:t>Install/build/flash the simulator. Use direct LTE where LTE-M is available, or choose relay mode as a backup.</w:t>
             </w:r>
           </w:p>
         </w:tc>
@@ -696,19 +682,11 @@
             <w:pPr>
               <w:spacing w:after="0"/>
             </w:pPr>
-            <w:proofErr w:type="gramStart"/>
             <w:r>
               <w:rPr>
                 <w:sz w:val="17"/>
               </w:rPr>
-              <w:t>developer</w:t>
-            </w:r>
-            <w:proofErr w:type="gramEnd"/>
-            <w:r>
-              <w:rPr>
-                <w:sz w:val="17"/>
-              </w:rPr>
-              <w:t xml:space="preserve"> must generate a new profile</w:t>
+              <w:t>developer must generate a new profile</w:t>
             </w:r>
           </w:p>
         </w:tc>
@@ -973,21 +951,7 @@
               <w:rPr>
                 <w:sz w:val="17"/>
               </w:rPr>
-              <w:t xml:space="preserve">west, git, building, and flashing. This terminal has </w:t>
-            </w:r>
-            <w:proofErr w:type="gramStart"/>
-            <w:r>
-              <w:rPr>
-                <w:sz w:val="17"/>
-              </w:rPr>
-              <w:t>the</w:t>
-            </w:r>
-            <w:proofErr w:type="gramEnd"/>
-            <w:r>
-              <w:rPr>
-                <w:sz w:val="17"/>
-              </w:rPr>
-              <w:t xml:space="preserve"> Nordic environment.</w:t>
+              <w:t>west, git, building, and flashing. This terminal has the Nordic environment.</w:t>
             </w:r>
           </w:p>
         </w:tc>
@@ -1285,21 +1249,7 @@
               <w:rPr>
                 <w:sz w:val="17"/>
               </w:rPr>
-              <w:t xml:space="preserve">ssh </w:t>
-            </w:r>
-            <w:proofErr w:type="gramStart"/>
-            <w:r>
-              <w:rPr>
-                <w:sz w:val="17"/>
-              </w:rPr>
-              <w:t>root@</w:t>
-            </w:r>
-            <w:proofErr w:type="gramEnd"/>
-            <w:r>
-              <w:rPr>
-                <w:sz w:val="17"/>
-              </w:rPr>
-              <w:t>&lt;server-</w:t>
+              <w:t>ssh root@&lt;server-</w:t>
             </w:r>
             <w:proofErr w:type="spellStart"/>
             <w:r>
@@ -1766,12 +1716,10 @@
               <w:t>$Workspace = Join-Path $</w:t>
             </w:r>
             <w:proofErr w:type="spellStart"/>
-            <w:proofErr w:type="gramStart"/>
             <w:r>
               <w:t>env:USERPROFILE</w:t>
             </w:r>
             <w:proofErr w:type="spellEnd"/>
-            <w:proofErr w:type="gramEnd"/>
             <w:r>
               <w:t xml:space="preserve"> "</w:t>
             </w:r>
@@ -1804,13 +1752,8 @@
               <w:t xml:space="preserve">Remove-Item </w:t>
             </w:r>
             <w:proofErr w:type="spellStart"/>
-            <w:proofErr w:type="gramStart"/>
-            <w:r>
-              <w:t>Env:ZEPHYR</w:t>
-            </w:r>
-            <w:proofErr w:type="gramEnd"/>
-            <w:r>
-              <w:t>_BASE</w:t>
+            <w:r>
+              <w:t>Env:ZEPHYR_BASE</w:t>
             </w:r>
             <w:proofErr w:type="spellEnd"/>
             <w:r>
@@ -1912,23 +1855,7 @@
                 <w:color w:val="FFFFFF"/>
                 <w:sz w:val="19"/>
               </w:rPr>
-              <w:t xml:space="preserve">If $Workspace already </w:t>
-            </w:r>
-            <w:proofErr w:type="gramStart"/>
-            <w:r>
-              <w:rPr>
-                <w:color w:val="FFFFFF"/>
-                <w:sz w:val="19"/>
-              </w:rPr>
-              <w:t>contains .west</w:t>
-            </w:r>
-            <w:proofErr w:type="gramEnd"/>
-            <w:r>
-              <w:rPr>
-                <w:color w:val="FFFFFF"/>
-                <w:sz w:val="19"/>
-              </w:rPr>
-              <w:t xml:space="preserve">, </w:t>
+              <w:t xml:space="preserve">If $Workspace already contains .west, </w:t>
             </w:r>
             <w:proofErr w:type="spellStart"/>
             <w:r>
@@ -2019,12 +1946,10 @@
               <w:t>$Workspace = Join-Path $</w:t>
             </w:r>
             <w:proofErr w:type="spellStart"/>
-            <w:proofErr w:type="gramStart"/>
             <w:r>
               <w:t>env:USERPROFILE</w:t>
             </w:r>
             <w:proofErr w:type="spellEnd"/>
-            <w:proofErr w:type="gramEnd"/>
             <w:r>
               <w:t xml:space="preserve"> "</w:t>
             </w:r>
@@ -2066,13 +1991,8 @@
               <w:t xml:space="preserve">Remove-Item </w:t>
             </w:r>
             <w:proofErr w:type="spellStart"/>
-            <w:proofErr w:type="gramStart"/>
-            <w:r>
-              <w:t>Env:ZEPHYR</w:t>
-            </w:r>
-            <w:proofErr w:type="gramEnd"/>
-            <w:r>
-              <w:t>_BASE</w:t>
+            <w:r>
+              <w:t>Env:ZEPHYR_BASE</w:t>
             </w:r>
             <w:proofErr w:type="spellEnd"/>
             <w:r>
@@ -2102,13 +2022,8 @@
               <w:pStyle w:val="CodeBlock"/>
             </w:pPr>
             <w:r>
-              <w:t>Test-</w:t>
-            </w:r>
-            <w:proofErr w:type="gramStart"/>
-            <w:r>
-              <w:t>Path .west</w:t>
-            </w:r>
-            <w:proofErr w:type="gramEnd"/>
+              <w:t>Test-Path .west</w:t>
+            </w:r>
           </w:p>
           <w:p>
             <w:pPr>
@@ -2445,13 +2360,8 @@
       <w:r>
         <w:t xml:space="preserve">Otherwise, </w:t>
       </w:r>
-      <w:proofErr w:type="gramStart"/>
-      <w:r>
-        <w:t>Generate</w:t>
-      </w:r>
-      <w:proofErr w:type="gramEnd"/>
-      <w:r>
-        <w:t xml:space="preserve"> a new profile using the Onomondo CLI</w:t>
+      <w:r>
+        <w:t>Generate a new profile using the Onomondo CLI</w:t>
       </w:r>
     </w:p>
     <w:tbl>
@@ -2789,15 +2699,7 @@
             </w:r>
             <w:proofErr w:type="spellEnd"/>
             <w:r>
-              <w:t xml:space="preserve"> -m PEM -b 4096 -</w:t>
-            </w:r>
-            <w:proofErr w:type="gramStart"/>
-            <w:r>
-              <w:t>f .</w:t>
-            </w:r>
-            <w:proofErr w:type="gramEnd"/>
-            <w:r>
-              <w:t>\</w:t>
+              <w:t xml:space="preserve"> -m PEM -b 4096 -f .\</w:t>
             </w:r>
             <w:proofErr w:type="spellStart"/>
             <w:r>
@@ -3015,15 +2917,7 @@
             </w:r>
             <w:proofErr w:type="spellEnd"/>
             <w:r>
-              <w:t xml:space="preserve"> -n 1 -</w:t>
-            </w:r>
-            <w:proofErr w:type="gramStart"/>
-            <w:r>
-              <w:t>o .</w:t>
-            </w:r>
-            <w:proofErr w:type="gramEnd"/>
-            <w:r>
-              <w:t>\profiles</w:t>
+              <w:t xml:space="preserve"> -n 1 -o .\profiles</w:t>
             </w:r>
           </w:p>
           <w:p>
@@ -3056,15 +2950,7 @@
             </w:pPr>
             <w:r>
               <w:br/>
-              <w:t>.\softsim.exe next --</w:t>
-            </w:r>
-            <w:proofErr w:type="gramStart"/>
-            <w:r>
-              <w:t>key .</w:t>
-            </w:r>
-            <w:proofErr w:type="gramEnd"/>
-            <w:r>
-              <w:t>\</w:t>
+              <w:t>.\softsim.exe next --key .\</w:t>
             </w:r>
             <w:proofErr w:type="spellStart"/>
             <w:r>
@@ -3075,17 +2961,12 @@
               <w:t xml:space="preserve"> -</w:t>
             </w:r>
             <w:proofErr w:type="spellStart"/>
-            <w:proofErr w:type="gramStart"/>
             <w:r>
               <w:t>i</w:t>
             </w:r>
             <w:proofErr w:type="spellEnd"/>
             <w:r>
-              <w:t xml:space="preserve"> .</w:t>
-            </w:r>
-            <w:proofErr w:type="gramEnd"/>
-            <w:r>
-              <w:t>\profiles --format=hex | Set-Content -Encoding ascii .\profile_001.hex</w:t>
+              <w:t xml:space="preserve"> .\profiles --format=hex | Set-Content -Encoding ascii .\profile_001.hex</w:t>
             </w:r>
           </w:p>
           <w:p>
@@ -3094,15 +2975,7 @@
             </w:pPr>
             <w:r>
               <w:br/>
-              <w:t>$profile = (Get-Content .\profile_001.hex -Raw</w:t>
-            </w:r>
-            <w:proofErr w:type="gramStart"/>
-            <w:r>
-              <w:t>).Trim</w:t>
-            </w:r>
-            <w:proofErr w:type="gramEnd"/>
-            <w:r>
-              <w:t>()</w:t>
+              <w:t>$profile = (Get-Content .\profile_001.hex -Raw).Trim()</w:t>
             </w:r>
           </w:p>
           <w:p>
@@ -3119,29 +2992,8 @@
             </w:r>
             <w:proofErr w:type="spellEnd"/>
             <w:r>
-              <w:t xml:space="preserve"> "^[0-9A-Fa-</w:t>
-            </w:r>
-            <w:proofErr w:type="gramStart"/>
-            <w:r>
-              <w:t>f]+</w:t>
-            </w:r>
-            <w:proofErr w:type="gramEnd"/>
-            <w:r>
-              <w:t xml:space="preserve">$") </w:t>
-            </w:r>
-            <w:proofErr w:type="gramStart"/>
-            <w:r>
-              <w:t>{ throw</w:t>
-            </w:r>
-            <w:proofErr w:type="gramEnd"/>
-            <w:r>
-              <w:t xml:space="preserve"> "Profile contains non-HEX characters.</w:t>
-            </w:r>
-            <w:proofErr w:type="gramStart"/>
-            <w:r>
-              <w:t>" }</w:t>
-            </w:r>
-            <w:proofErr w:type="gramEnd"/>
+              <w:t xml:space="preserve"> "^[0-9A-Fa-f]+$") { throw "Profile contains non-HEX characters." }</w:t>
+            </w:r>
           </w:p>
           <w:p>
             <w:pPr>
@@ -3149,38 +3001,16 @@
             </w:pPr>
             <w:r>
               <w:br/>
-            </w:r>
-            <w:proofErr w:type="gramStart"/>
-            <w:r>
-              <w:t>if ((</w:t>
-            </w:r>
-            <w:proofErr w:type="gramEnd"/>
-            <w:r>
-              <w:t>$</w:t>
+              <w:t>if (($</w:t>
             </w:r>
             <w:proofErr w:type="spellStart"/>
-            <w:proofErr w:type="gramStart"/>
             <w:r>
               <w:t>profile.Length</w:t>
             </w:r>
             <w:proofErr w:type="spellEnd"/>
-            <w:proofErr w:type="gramEnd"/>
-            <w:r>
-              <w:t xml:space="preserve"> % 2) -ne 0) </w:t>
-            </w:r>
-            <w:proofErr w:type="gramStart"/>
-            <w:r>
-              <w:t>{ throw</w:t>
-            </w:r>
-            <w:proofErr w:type="gramEnd"/>
-            <w:r>
-              <w:t xml:space="preserve"> "Profile has an odd number of HEX characters.</w:t>
-            </w:r>
-            <w:proofErr w:type="gramStart"/>
-            <w:r>
-              <w:t>" }</w:t>
-            </w:r>
-            <w:proofErr w:type="gramEnd"/>
+            <w:r>
+              <w:t xml:space="preserve"> % 2) -ne 0) { throw "Profile has an odd number of HEX characters." }</w:t>
+            </w:r>
           </w:p>
           <w:p>
             <w:pPr>
@@ -3328,7 +3158,19 @@
         <w:rPr>
           <w:highlight w:val="yellow"/>
         </w:rPr>
-        <w:t xml:space="preserve">Move the zip folder “Micro_Simulator_Dual_Transport_Complete_v4” to C:\tmp. </w:t>
+        <w:t>Move the zip folder “Micro_Simulator_Dual_Transport_Complete_v</w:t>
+      </w:r>
+      <w:r>
+        <w:rPr>
+          <w:highlight w:val="yellow"/>
+        </w:rPr>
+        <w:t>5</w:t>
+      </w:r>
+      <w:r>
+        <w:rPr>
+          <w:highlight w:val="yellow"/>
+        </w:rPr>
+        <w:t xml:space="preserve">” to C:\tmp. </w:t>
       </w:r>
     </w:p>
     <w:p>
@@ -3372,7 +3214,6 @@
         <w:t xml:space="preserve"> The installer derives the workspace from $</w:t>
       </w:r>
       <w:proofErr w:type="spellStart"/>
-      <w:proofErr w:type="gramStart"/>
       <w:r>
         <w:rPr>
           <w:i/>
@@ -3382,7 +3223,6 @@
         <w:t>env:USERPROFILE</w:t>
       </w:r>
       <w:proofErr w:type="spellEnd"/>
-      <w:proofErr w:type="gramEnd"/>
       <w:r>
         <w:rPr>
           <w:i/>
@@ -3429,7 +3269,19 @@
             </w:r>
             <w:proofErr w:type="spellEnd"/>
             <w:r>
-              <w:t xml:space="preserve"> = "C:\tmp\Micro_Simulator_Dual_Transport_Complete_v4\Micro_Simulator_Dual_Transport_Complete_v4"</w:t>
+              <w:t xml:space="preserve"> = "C:\tmp\Micro_Simulator_Dual_Transport_Complete_v</w:t>
+            </w:r>
+            <w:r>
+              <w:t>5</w:t>
+            </w:r>
+            <w:r>
+              <w:t>\Micro_Simulator_Dual_Transport_Complete_v</w:t>
+            </w:r>
+            <w:r>
+              <w:t>5</w:t>
+            </w:r>
+            <w:r>
+              <w:t>"</w:t>
             </w:r>
           </w:p>
           <w:p>
@@ -3501,15 +3353,7 @@
         <w:spacing w:after="40"/>
       </w:pPr>
       <w:r>
-        <w:t>Installed firmware path: $</w:t>
-      </w:r>
-      <w:proofErr w:type="gramStart"/>
-      <w:r>
-        <w:t>env:USERPROFILE</w:t>
-      </w:r>
-      <w:proofErr w:type="gramEnd"/>
-      <w:r>
-        <w:t>\onomondo-softsim-test\applications\micro_simulator</w:t>
+        <w:t>Installed firmware path: $env:USERPROFILE\onomondo-softsim-test\applications\micro_simulator</w:t>
       </w:r>
     </w:p>
     <w:p>
@@ -3521,12 +3365,10 @@
         <w:t>Installed relay path: $</w:t>
       </w:r>
       <w:proofErr w:type="spellStart"/>
-      <w:proofErr w:type="gramStart"/>
       <w:r>
         <w:t>env:USERPROFILE</w:t>
       </w:r>
       <w:proofErr w:type="spellEnd"/>
-      <w:proofErr w:type="gramEnd"/>
       <w:r>
         <w:t>\</w:t>
       </w:r>
@@ -3762,12 +3604,10 @@
               <w:t>$Workspace = Join-Path $</w:t>
             </w:r>
             <w:proofErr w:type="spellStart"/>
-            <w:proofErr w:type="gramStart"/>
             <w:r>
               <w:t>env:USERPROFILE</w:t>
             </w:r>
             <w:proofErr w:type="spellEnd"/>
-            <w:proofErr w:type="gramEnd"/>
             <w:r>
               <w:t xml:space="preserve"> "</w:t>
             </w:r>
@@ -3806,13 +3646,8 @@
               <w:t xml:space="preserve">Remove-Item </w:t>
             </w:r>
             <w:proofErr w:type="spellStart"/>
-            <w:proofErr w:type="gramStart"/>
-            <w:r>
-              <w:t>Env:ZEPHYR</w:t>
-            </w:r>
-            <w:proofErr w:type="gramEnd"/>
-            <w:r>
-              <w:t>_BASE</w:t>
+            <w:r>
+              <w:t>Env:ZEPHYR_BASE</w:t>
             </w:r>
             <w:proofErr w:type="spellEnd"/>
             <w:r>
@@ -3970,12 +3805,10 @@
               <w:t>$Workspace = Join-Path $</w:t>
             </w:r>
             <w:proofErr w:type="spellStart"/>
-            <w:proofErr w:type="gramStart"/>
             <w:r>
               <w:t>env:USERPROFILE</w:t>
             </w:r>
             <w:proofErr w:type="spellEnd"/>
-            <w:proofErr w:type="gramEnd"/>
             <w:r>
               <w:t xml:space="preserve"> "</w:t>
             </w:r>
@@ -4013,11 +3846,9 @@
             <w:pPr>
               <w:spacing w:after="20"/>
             </w:pPr>
-            <w:proofErr w:type="gramStart"/>
             <w:r>
               <w:t>@'</w:t>
             </w:r>
-            <w:proofErr w:type="gramEnd"/>
           </w:p>
           <w:p>
             <w:pPr>
@@ -4124,15 +3955,7 @@
         <w:spacing w:after="20"/>
       </w:pPr>
       <w:r>
-        <w:t xml:space="preserve">Reset the Board via the connected device or physical button. In a </w:t>
-      </w:r>
-      <w:proofErr w:type="gramStart"/>
-      <w:r>
-        <w:t>com port</w:t>
-      </w:r>
-      <w:proofErr w:type="gramEnd"/>
-      <w:r>
-        <w:t xml:space="preserve"> you should see:</w:t>
+        <w:t>Reset the Board via the connected device or physical button. In a com port you should see:</w:t>
       </w:r>
     </w:p>
     <w:p>
@@ -4274,23 +4097,7 @@
           <w:sz w:val="18"/>
           <w:szCs w:val="20"/>
         </w:rPr>
-        <w:t xml:space="preserve"> using </w:t>
-      </w:r>
-      <w:proofErr w:type="gramStart"/>
-      <w:r>
-        <w:rPr>
-          <w:sz w:val="18"/>
-          <w:szCs w:val="20"/>
-        </w:rPr>
-        <w:t>the Windows</w:t>
-      </w:r>
-      <w:proofErr w:type="gramEnd"/>
-      <w:r>
-        <w:rPr>
-          <w:sz w:val="18"/>
-          <w:szCs w:val="20"/>
-        </w:rPr>
-        <w:t xml:space="preserve"> Wi-Fi relay.</w:t>
+        <w:t xml:space="preserve"> using the Windows Wi-Fi relay.</w:t>
       </w:r>
     </w:p>
     <w:p>
@@ -5020,15 +4827,7 @@
         <w:t xml:space="preserve"> press enter.</w:t>
       </w:r>
       <w:r>
-        <w:t xml:space="preserve"> The pasted HEX may </w:t>
-      </w:r>
-      <w:proofErr w:type="gramStart"/>
-      <w:r>
-        <w:t>not visibly</w:t>
-      </w:r>
-      <w:proofErr w:type="gramEnd"/>
-      <w:r>
-        <w:t xml:space="preserve"> echo.</w:t>
+        <w:t xml:space="preserve"> The pasted HEX may not visibly echo.</w:t>
       </w:r>
     </w:p>
     <w:p>
@@ -5058,15 +4857,7 @@
         <w:t xml:space="preserve">6. </w:t>
       </w:r>
       <w:r>
-        <w:t xml:space="preserve">After </w:t>
-      </w:r>
-      <w:proofErr w:type="gramStart"/>
-      <w:r>
-        <w:t>reboot</w:t>
-      </w:r>
-      <w:proofErr w:type="gramEnd"/>
-      <w:r>
-        <w:t xml:space="preserve">, run </w:t>
+        <w:t xml:space="preserve">After reboot, run </w:t>
       </w:r>
       <w:proofErr w:type="spellStart"/>
       <w:r>
@@ -5422,12 +5213,10 @@
               <w:t>$Workspace = Join-Path $</w:t>
             </w:r>
             <w:proofErr w:type="spellStart"/>
-            <w:proofErr w:type="gramStart"/>
             <w:r>
               <w:t>env:USERPROFILE</w:t>
             </w:r>
             <w:proofErr w:type="spellEnd"/>
-            <w:proofErr w:type="gramEnd"/>
             <w:r>
               <w:t xml:space="preserve"> "</w:t>
             </w:r>
@@ -5586,25 +5375,7 @@
           <w:color w:val="5A5A5A"/>
           <w:sz w:val="17"/>
         </w:rPr>
-        <w:t xml:space="preserve"> Use the VS CODE -&gt; Connected Devices-&gt; COM port to see what the active, talking, COM port is </w:t>
-      </w:r>
-      <w:proofErr w:type="gramStart"/>
-      <w:r>
-        <w:rPr>
-          <w:i/>
-          <w:color w:val="5A5A5A"/>
-          <w:sz w:val="17"/>
-        </w:rPr>
-        <w:t>actually named</w:t>
-      </w:r>
-      <w:proofErr w:type="gramEnd"/>
-      <w:r>
-        <w:rPr>
-          <w:i/>
-          <w:color w:val="5A5A5A"/>
-          <w:sz w:val="17"/>
-        </w:rPr>
-        <w:t xml:space="preserve">. </w:t>
+        <w:t xml:space="preserve"> Use the VS CODE -&gt; Connected Devices-&gt; COM port to see what the active, talking, COM port is actually named. </w:t>
       </w:r>
     </w:p>
     <w:p>
@@ -5652,12 +5423,10 @@
               <w:t>$Workspace = Join-Path $</w:t>
             </w:r>
             <w:proofErr w:type="spellStart"/>
-            <w:proofErr w:type="gramStart"/>
             <w:r>
               <w:t>env:USERPROFILE</w:t>
             </w:r>
             <w:proofErr w:type="spellEnd"/>
-            <w:proofErr w:type="gramEnd"/>
             <w:r>
               <w:t xml:space="preserve"> "</w:t>
             </w:r>
@@ -5828,25 +5597,7 @@
           <w:color w:val="5A5A5A"/>
           <w:sz w:val="17"/>
         </w:rPr>
-        <w:t xml:space="preserve">Try </w:t>
-      </w:r>
-      <w:proofErr w:type="gramStart"/>
-      <w:r>
-        <w:rPr>
-          <w:i/>
-          <w:color w:val="5A5A5A"/>
-          <w:sz w:val="17"/>
-        </w:rPr>
-        <w:t>typing  these</w:t>
-      </w:r>
-      <w:proofErr w:type="gramEnd"/>
-      <w:r>
-        <w:rPr>
-          <w:i/>
-          <w:color w:val="5A5A5A"/>
-          <w:sz w:val="17"/>
-        </w:rPr>
-        <w:t xml:space="preserve"> commands into the Python relay console.</w:t>
+        <w:t>Try typing  these commands into the Python relay console.</w:t>
       </w:r>
     </w:p>
     <w:tbl>
@@ -6847,19 +6598,11 @@
               <w:t xml:space="preserve">Run Remove-Item </w:t>
             </w:r>
             <w:proofErr w:type="spellStart"/>
-            <w:proofErr w:type="gramStart"/>
             <w:r>
               <w:rPr>
                 <w:sz w:val="17"/>
               </w:rPr>
-              <w:t>Env:ZEPHYR</w:t>
-            </w:r>
-            <w:proofErr w:type="gramEnd"/>
-            <w:r>
-              <w:rPr>
-                <w:sz w:val="17"/>
-              </w:rPr>
-              <w:t>_BASE</w:t>
+              <w:t>Env:ZEPHYR_BASE</w:t>
             </w:r>
             <w:proofErr w:type="spellEnd"/>
             <w:r>
@@ -7108,7 +6851,6 @@
               <w:t xml:space="preserve">Board has no </w:t>
             </w:r>
             <w:proofErr w:type="spellStart"/>
-            <w:proofErr w:type="gramStart"/>
             <w:r>
               <w:rPr>
                 <w:sz w:val="17"/>
@@ -7116,7 +6858,6 @@
               <w:t>SoftSIM</w:t>
             </w:r>
             <w:proofErr w:type="spellEnd"/>
-            <w:proofErr w:type="gramEnd"/>
             <w:r>
               <w:rPr>
                 <w:sz w:val="17"/>
@@ -7165,21 +6906,7 @@
               <w:rPr>
                 <w:sz w:val="17"/>
               </w:rPr>
-              <w:t xml:space="preserve">Use relay </w:t>
-            </w:r>
-            <w:proofErr w:type="gramStart"/>
-            <w:r>
-              <w:rPr>
-                <w:sz w:val="17"/>
-              </w:rPr>
-              <w:t>mode, or</w:t>
-            </w:r>
-            <w:proofErr w:type="gramEnd"/>
-            <w:r>
-              <w:rPr>
-                <w:sz w:val="17"/>
-              </w:rPr>
-              <w:t xml:space="preserve"> run </w:t>
+              <w:t xml:space="preserve">Use relay mode, or run </w:t>
             </w:r>
             <w:proofErr w:type="spellStart"/>
             <w:r>
@@ -7428,14 +7155,7 @@
               <w:rPr>
                 <w:sz w:val="17"/>
               </w:rPr>
-              <w:t xml:space="preserve">Run setup_windows_relay.ps1 from standard Windows PowerShell and use the </w:t>
-            </w:r>
-            <w:proofErr w:type="gramStart"/>
-            <w:r>
-              <w:rPr>
-                <w:sz w:val="17"/>
-              </w:rPr>
-              <w:t>dedicated .</w:t>
+              <w:t>Run setup_windows_relay.ps1 from standard Windows PowerShell and use the dedicated .</w:t>
             </w:r>
             <w:proofErr w:type="spellStart"/>
             <w:r>
@@ -7445,7 +7165,6 @@
               <w:t>venv</w:t>
             </w:r>
             <w:proofErr w:type="spellEnd"/>
-            <w:proofErr w:type="gramEnd"/>
             <w:r>
               <w:rPr>
                 <w:sz w:val="17"/>

</xml_diff>